<commit_message>
Corrige referencias a Vadim: ya no estudia, trabaja como diseñador gráfico
Actualiza el perfil de la familia y todas las frases del documento de
ejercicios que lo describían como estudiante (colegio, amigos del
colegio, dibujos animados) para reflejar que es adulto y trabaja como
diseñador gráfico.

Co-Authored-By: Claude Sonnet 5 <noreply@anthropic.com>
Claude-Session: https://claude.ai/code/session_01SV4AB4NNKiXaeMuGEkh2i2
</commit_message>
<xml_diff>
--- a/docencia-espanol/materiales/a1/a1_sasha-alexander_ejercicios-presente-gerundio-indefinido.docx
+++ b/docencia-espanol/materiales/a1/a1_sasha-alexander_ejercicios-presente-gerundio-indefinido.docx
@@ -87,7 +87,7 @@
           <w:iCs/>
           <w:color w:val="555555"/>
         </w:rPr>
-        <w:t xml:space="preserve">Instrucciones generales: completa cada ejercicio con la forma correcta del verbo. Los ejercicios están organizados en cuatro bloques: el presente, estar + gerundio, el pretérito indefinido, y un bloque final de contraste entre los tres. Algunas frases están inspiradas en la vida de Sasha y Alexander (Alicante, Vadim, Wildberries, el mundo de la moda, los negocios), y otras son de repaso general. Al final encontrarás las soluciones.</w:t>
+        <w:t xml:space="preserve">Instrucciones generales: completa cada ejercicio con la forma correcta del verbo. Los ejercicios están organizados en cuatro bloques: el presente, estar + gerundio, el pretérito indefinido, y un bloque final de contraste entre los tres. Algunas frases están inspiradas en la vida de Sasha y Alexander (Alicante, Vadim —diseñador gráfico—, Wildberries, el mundo de la moda, los negocios), y otras son de repaso general. Al final encontrarás las soluciones.</w:t>
       </w:r>
     </w:p>
     <w:p>
@@ -195,7 +195,7 @@
         <w:t xml:space="preserve">c. </w:t>
       </w:r>
       <w:r>
-        <w:t xml:space="preserve">Vadim ___________ (comer) en el colegio los días de clase.</w:t>
+        <w:t xml:space="preserve">Vadim ___________ (comer) en el estudio los días de trabajo.</w:t>
       </w:r>
     </w:p>
     <w:p>
@@ -318,7 +318,7 @@
         <w:t xml:space="preserve">d. </w:t>
       </w:r>
       <w:r>
-        <w:t xml:space="preserve">Vadim no ___________ en casa ahora, ___________ en el colegio. (ser / estar)</w:t>
+        <w:t xml:space="preserve">Vadim no ___________ en casa ahora, ___________ en el estudio. (ser / estar)</w:t>
       </w:r>
     </w:p>
     <w:p>
@@ -484,7 +484,7 @@
         <w:t xml:space="preserve">a. </w:t>
       </w:r>
       <w:r>
-        <w:t xml:space="preserve">Vadim ___________ (levantarse) a las siete y media para ir al colegio.</w:t>
+        <w:t xml:space="preserve">Vadim ___________ (levantarse) a las siete y media para ir al estudio.</w:t>
       </w:r>
     </w:p>
     <w:p>
@@ -623,7 +623,7 @@
         <w:t xml:space="preserve">c. </w:t>
       </w:r>
       <w:r>
-        <w:t xml:space="preserve">___________________________ ? — Vadim va al colegio todas las mañanas.</w:t>
+        <w:t xml:space="preserve">___________________________ ? — Vadim va al estudio todas las mañanas.</w:t>
       </w:r>
     </w:p>
     <w:p>
@@ -696,7 +696,7 @@
           <w:i w:val="false"/>
           <w:iCs w:val="false"/>
         </w:rPr>
-        <w:t xml:space="preserve">Vadim (1) ___________ (levantarse) a las siete y media y (2) ___________ (desayunar) con sus padres. Sasha (3) ___________ (trabajar) desde casa y (4) ___________ (empezar) a las nueve. Ella (5) ___________ (diseñar) ropa nueva y (6) ___________ (vender) las colecciones en Wildberries. Alexander (7) ___________ (ir) a la oficina y (8) ___________ (volver) a casa por la tarde. Los fines de semana, ellos (9) ___________ (ir) a la playa porque (10) ___________ (vivir) muy cerca del mar.</w:t>
+        <w:t xml:space="preserve">Vadim (1) ___________ (levantarse) a las siete y media y (2) ___________ (desayunar) antes de ir a su estudio de diseño. Sasha (3) ___________ (trabajar) desde casa y (4) ___________ (empezar) a las nueve. Ella (5) ___________ (diseñar) ropa nueva y (6) ___________ (vender) las colecciones en Wildberries. Alexander (7) ___________ (ir) a la oficina y (8) ___________ (volver) a casa por la tarde. Los fines de semana, ellos (9) ___________ (ir) a la playa porque (10) ___________ (vivir) muy cerca del mar.</w:t>
       </w:r>
     </w:p>
     <w:p>
@@ -1622,7 +1622,7 @@
           <w:i w:val="false"/>
           <w:iCs w:val="false"/>
         </w:rPr>
-        <w:t xml:space="preserve">— Él (5) ___________ (ver) dibujos animados en el salón.</w:t>
+        <w:t xml:space="preserve">— Él (5) ___________ (ver) una serie en el salón.</w:t>
       </w:r>
     </w:p>
     <w:p>
@@ -1729,7 +1729,7 @@
         <w:t xml:space="preserve">e. </w:t>
       </w:r>
       <w:r>
-        <w:t xml:space="preserve">Vadim está vistiendose para ir al colegio. → ___________________________</w:t>
+        <w:t xml:space="preserve">Vadim está vistiendose para ir al estudio. → ___________________________</w:t>
       </w:r>
     </w:p>
     <w:p>
@@ -2520,7 +2520,7 @@
           <w:i w:val="false"/>
           <w:iCs w:val="false"/>
         </w:rPr>
-        <w:t xml:space="preserve">— Muy bien. (2) ___________ (Venir) sus amigos del colegio y nosotros (3) ___________ (celebrar) la fiesta en la playa.</w:t>
+        <w:t xml:space="preserve">— Muy bien. (2) ___________ (Venir) sus amigos y nosotros (3) ___________ (celebrar) la fiesta en la playa.</w:t>
       </w:r>
     </w:p>
     <w:p>
@@ -3056,7 +3056,7 @@
         <w:t xml:space="preserve">d. </w:t>
       </w:r>
       <w:r>
-        <w:t xml:space="preserve">Vadim normalmente ___________ (comer) en el colegio, pero ayer ___________ (comer) en casa porque estaba enfermo.</w:t>
+        <w:t xml:space="preserve">Vadim normalmente ___________ (comer) en el estudio, pero ayer ___________ (comer) en casa porque estaba enfermo.</w:t>
       </w:r>
     </w:p>
     <w:p>
@@ -3097,7 +3097,7 @@
           <w:i w:val="false"/>
           <w:iCs w:val="false"/>
         </w:rPr>
-        <w:t xml:space="preserve">Hoy es sábado y la familia no trabaja. Normalmente Sasha (1) ___________ (trabajar) todos los días de la semana, pero los sábados descansa. Ahora mismo, ella (2) ___________ (preparar) el desayuno y Vadim (3) ___________ (jugar) en el jardín. El año pasado, para las vacaciones de verano, toda la familia (4) ___________ (ir) a Rusia y lo (5) ___________ (pasar) muy bien con los abuelos. Este fin de semana, van a ir a la playa por la tarde. En este momento, Alexander (6) ___________ (hablar) por teléfono con un cliente, mientras Sasha (7) ___________ (pensar) en su próxima colección de ropa. A los dos les (8) ___________ (gustar) mucho la vida tranquila que (9) ___________ (tener) en Alicante, cerca del mar.</w:t>
+        <w:t xml:space="preserve">Hoy es sábado y la familia no trabaja. Normalmente Sasha (1) ___________ (trabajar) todos los días de la semana, pero los sábados descansa. Ahora mismo, ella (2) ___________ (preparar) el desayuno y Vadim (3) ___________ (desayunar) en el jardín. El año pasado, para las vacaciones de verano, toda la familia (4) ___________ (ir) a Rusia y lo (5) ___________ (pasar) muy bien con los abuelos. Este fin de semana, van a ir a la playa por la tarde. En este momento, Alexander (6) ___________ (hablar) por teléfono con un cliente, mientras Sasha (7) ___________ (pensar) en su próxima colección de ropa. A los dos les (8) ___________ (gustar) mucho la vida tranquila que (9) ___________ (tener) en Alicante, cerca del mar.</w:t>
       </w:r>
     </w:p>
     <w:p>
@@ -3465,7 +3465,7 @@
           <w:i w:val="false"/>
           <w:iCs w:val="false"/>
         </w:rPr>
-        <w:t xml:space="preserve">a. Sasha está diseñando ropa ahora mismo. (la segunda parte usa el presente correctamente)  b. Alexander está durmiendo la siesta.  c. Nosotros estamos comiendo y hablando. / Estamos cenando juntos.  d. Yo estoy escribiendo un correo a un cliente.  e. Vadim está vistiéndose para ir al colegio.</w:t>
+        <w:t xml:space="preserve">a. Sasha está diseñando ropa ahora mismo. (la segunda parte usa el presente correctamente)  b. Alexander está durmiendo la siesta.  c. Nosotros estamos comiendo y hablando. / Estamos cenando juntos.  d. Yo estoy escribiendo un correo a un cliente.  e. Vadim está vistiéndose para ir al estudio.</w:t>
       </w:r>
     </w:p>
     <w:p>
@@ -3689,7 +3689,7 @@
           <w:i w:val="false"/>
           <w:iCs w:val="false"/>
         </w:rPr>
-        <w:t xml:space="preserve">1. trabaja  2. está preparando  3. está jugando  4. fue  5. pasó  6. está hablando  7. está pensando  8. gusta  9. tienen</w:t>
+        <w:t xml:space="preserve">1. trabaja  2. está preparando  3. está desayunando  4. fue  5. pasó  6. está hablando  7. está pensando  8. gusta  9. tienen</w:t>
       </w:r>
     </w:p>
     <w:sectPr>

</xml_diff>